<commit_message>
Resolve merge conflicts — keep multithreading + calendar features
</commit_message>
<xml_diff>
--- a/backend/outputs/pipeline_brief.docx
+++ b/backend/outputs/pipeline_brief.docx
@@ -221,7 +221,7 @@
           </w:tcPr>
           <w:p>
             <w:r>
-              <w:t>30%</w:t>
+              <w:t>5%</w:t>
             </w:r>
           </w:p>
         </w:tc>
@@ -273,7 +273,7 @@
           </w:tcPr>
           <w:p>
             <w:r>
-              <w:t>35%</w:t>
+              <w:t>10%</w:t>
             </w:r>
           </w:p>
         </w:tc>
@@ -325,7 +325,7 @@
           </w:tcPr>
           <w:p>
             <w:r>
-              <w:t>55%</w:t>
+              <w:t>30%</w:t>
             </w:r>
           </w:p>
         </w:tc>
@@ -335,7 +335,7 @@
           </w:tcPr>
           <w:p>
             <w:r>
-              <w:t>AMBER</w:t>
+              <w:t>RED</w:t>
             </w:r>
           </w:p>
         </w:tc>
@@ -377,7 +377,7 @@
           </w:tcPr>
           <w:p>
             <w:r>
-              <w:t>70%</w:t>
+              <w:t>45%</w:t>
             </w:r>
           </w:p>
         </w:tc>
@@ -387,7 +387,7 @@
           </w:tcPr>
           <w:p>
             <w:r>
-              <w:t>AMBER</w:t>
+              <w:t>RED</w:t>
             </w:r>
           </w:p>
         </w:tc>
@@ -429,7 +429,7 @@
           </w:tcPr>
           <w:p>
             <w:r>
-              <w:t>100%</w:t>
+              <w:t>75%</w:t>
             </w:r>
           </w:p>
         </w:tc>
@@ -439,7 +439,7 @@
           </w:tcPr>
           <w:p>
             <w:r>
-              <w:t>GREEN</w:t>
+              <w:t>AMBER</w:t>
             </w:r>
           </w:p>
         </w:tc>
@@ -481,7 +481,7 @@
           </w:tcPr>
           <w:p>
             <w:r>
-              <w:t>100%</w:t>
+              <w:t>90%</w:t>
             </w:r>
           </w:p>
         </w:tc>
@@ -533,7 +533,7 @@
           </w:tcPr>
           <w:p>
             <w:r>
-              <w:t>100%</w:t>
+              <w:t>90%</w:t>
             </w:r>
           </w:p>
         </w:tc>
@@ -585,7 +585,7 @@
           </w:tcPr>
           <w:p>
             <w:r>
-              <w:t>100%</w:t>
+              <w:t>90%</w:t>
             </w:r>
           </w:p>
         </w:tc>
@@ -624,9 +624,9 @@
         <w:br/>
         <w:t>* **Pipeline Impact:** $450,000 | **Target Close:** 2024-05-30 | **Health:** 0/100</w:t>
         <w:br/>
-        <w:t>* **The Bottom Line:** Initech's champion, John Smith, has expressed concerns about ROI, and the customer has stalled on the proof-of-concept. We need to address these concerns and re-engage the customer to move the deal forward.</w:t>
+        <w:t>* **The Bottom Line:** Initech's champion, John Smith, has expressed concerns about ROI, and the customer has stalled on the contract review. We need to address these concerns and re-engage John to move the deal forward.</w:t>
         <w:br/>
-        <w:t>* **Manager Action Today:** Schedule a call with John Smith to discuss Initech's ROI concerns and provide a revised proof-of-concept plan to re-energize the deal.</w:t>
+        <w:t>* **Manager Action Today:** Schedule a call with John Smith to discuss Initech's ROI concerns and re-iterate the value proposition.</w:t>
       </w:r>
     </w:p>
     <w:p/>
@@ -652,9 +652,9 @@
         <w:br/>
         <w:t>* **Pipeline Impact:** $340,000 | **Target Close:** 2024-06-15 | **Health:** 0/100</w:t>
         <w:br/>
-        <w:t>* **The Bottom Line:** Acme Corp's deal momentum has stalled due to ongoing budget approval delays, and key decision-maker, John Smith, has expressed concerns about ROI. Champion, Emily Johnson, is still engaged but needs to escalate the issue to secure approval.</w:t>
+        <w:t>* **The Bottom Line:** Acme Corp's deal momentum has stalled due to ongoing budget approval delays, and key decision-maker, Rachel Lee, has expressed concerns about ROI. Champion, John Smith, is still engaged but needs to escalate the issue to secure approval.</w:t>
         <w:br/>
-        <w:t>* **Manager Action Today:** Escalate the issue to Emily Johnson and request her to schedule a meeting with John Smith to address budget concerns and provide a revised ROI analysis.</w:t>
+        <w:t>* **Manager Action Today:** Escalate the issue to Rachel Lee and offer a revised ROI analysis to address her concerns.</w:t>
       </w:r>
     </w:p>
     <w:p/>
@@ -671,18 +671,18 @@
     </w:p>
     <w:p>
       <w:r>
-        <w:t>Value: $180,000   Close: 2024-06-20   Score: 30%</w:t>
+        <w:t>Value: $180,000   Close: 2024-06-20   Score: 5%</w:t>
       </w:r>
     </w:p>
     <w:p>
       <w:r>
         <w:t>### 🔴 RED | Globex Inc</w:t>
         <w:br/>
-        <w:t>* **Pipeline Impact:** $180,000 | **Target Close:** 2024-06-20 | **Health:** 30/100</w:t>
+        <w:t>* **Pipeline Impact:** $180,000 | **Target Close:** 2024-06-20 | **Health:** 5/100</w:t>
         <w:br/>
-        <w:t>* **The Bottom Line:** The deal's health is at risk due to a 3-week delay in the champion's decision-making process, which has stalled the sales momentum. The sales team must address the champion's concerns about ROI before the target close date.</w:t>
+        <w:t>* **The Bottom Line:** The deal is at risk due to a 30-day delay in the champion's decision-making process, and the customer has raised concerns about the total cost of ownership. The sales team needs to address these concerns and re-engage the champion to get the deal back on track.</w:t>
         <w:br/>
-        <w:t>* **Manager Action Today:** Schedule a call with the champion to discuss ROI and address their concerns by the end of the day.</w:t>
+        <w:t>* **Manager Action Today:** Schedule a call with the champion to discuss the total cost of ownership and provide a revised proposal to alleviate their concerns.</w:t>
       </w:r>
     </w:p>
     <w:p/>
@@ -699,18 +699,74 @@
     </w:p>
     <w:p>
       <w:r>
-        <w:t>Value: $650,000   Close: 2024-07-10   Score: 35%</w:t>
+        <w:t>Value: $650,000   Close: 2024-07-10   Score: 10%</w:t>
       </w:r>
     </w:p>
     <w:p>
       <w:r>
         <w:t>### 🔴 RED | Umbrella Corp</w:t>
         <w:br/>
-        <w:t>* **Pipeline Impact:** $650,000 | **Target Close:** 2024-07-10 | **Health:** 35/100</w:t>
+        <w:t>* **Pipeline Impact:** $650,000 | **Target Close:** 2024-07-10 | **Health:** 10/100</w:t>
         <w:br/>
-        <w:t>* **The Bottom Line:** The deal is at risk due to a 30-day delay in decision-making from the champion, Alex Chen, and unresolved concerns about integration costs. We need to re-engage Alex and address these concerns to get the deal back on track.</w:t>
+        <w:t>* **The Bottom Line:** The deal is at risk due to a 30-day delay in the decision-making process, and the champion, Rachel Lee, has expressed concerns about the total cost of ownership. We need to address these concerns and expedite the decision-making process to meet the target close date.</w:t>
         <w:br/>
-        <w:t>* **Manager Action Today:** Re-schedule a call with Alex Chen to discuss the integration costs and re-iterate the value proposition.</w:t>
+        <w:t>* **Manager Action Today:** Schedule a call with Rachel Lee to discuss the total cost of ownership and provide a revised proposal to alleviate her concerns.</w:t>
+      </w:r>
+    </w:p>
+    <w:p/>
+    <w:p>
+      <w:pPr>
+        <w:pStyle w:val="Heading2"/>
+      </w:pPr>
+      <w:r>
+        <w:rPr>
+          <w:color w:val="E53935"/>
+        </w:rPr>
+        <w:t>Stark Ind</w:t>
+      </w:r>
+    </w:p>
+    <w:p>
+      <w:r>
+        <w:t>Value: $850,000   Close: 2024-06-05   Score: 30%</w:t>
+      </w:r>
+    </w:p>
+    <w:p>
+      <w:r>
+        <w:t>### 🔴 RED | Stark Ind</w:t>
+        <w:br/>
+        <w:t>* **Pipeline Impact:** $850,000 | **Target Close:** 2024-06-05 | **Health:** 30/100</w:t>
+        <w:br/>
+        <w:t>* **The Bottom Line:** The deal's health is at 30% due to a 3-week delay in the champion's decision-making process, which has stalled the contract negotiation. The sales team needs to re-engage the champion, John Lee, to overcome the objection about pricing.</w:t>
+        <w:br/>
+        <w:t>* **Manager Action Today:** Re-engage John Lee with a call to discuss pricing concerns and provide a revised proposal by EOD.</w:t>
+      </w:r>
+    </w:p>
+    <w:p/>
+    <w:p>
+      <w:pPr>
+        <w:pStyle w:val="Heading2"/>
+      </w:pPr>
+      <w:r>
+        <w:rPr>
+          <w:color w:val="E53935"/>
+        </w:rPr>
+        <w:t>Wayne Ent</w:t>
+      </w:r>
+    </w:p>
+    <w:p>
+      <w:r>
+        <w:t>Value: $500,000   Close: 2024-06-25   Score: 45%</w:t>
+      </w:r>
+    </w:p>
+    <w:p>
+      <w:r>
+        <w:t>### 🔴 RED | Wayne Ent</w:t>
+        <w:br/>
+        <w:t>* **Pipeline Impact:** $500,000 | **Target Close:** 2024-06-25 | **Health:** 45/100</w:t>
+        <w:br/>
+        <w:t>* **The Bottom Line:** Wayne Ent's pipeline is at risk due to a 30-day delay in champion feedback and a 20% drop in decision-maker engagement. Champion, Rachel Lee, has expressed concerns about ROI, which needs to be addressed ASAP.</w:t>
+        <w:br/>
+        <w:t>* **Manager Action Today:** Schedule a call with Rachel Lee to discuss ROI concerns and provide a customized case study to alleviate her doubts.</w:t>
       </w:r>
     </w:p>
     <w:p/>
@@ -722,79 +778,23 @@
         <w:rPr>
           <w:color w:val="F5A623"/>
         </w:rPr>
-        <w:t>Stark Ind</w:t>
-      </w:r>
-    </w:p>
-    <w:p>
-      <w:r>
-        <w:t>Value: $850,000   Close: 2024-06-05   Score: 55%</w:t>
-      </w:r>
-    </w:p>
-    <w:p>
-      <w:r>
-        <w:t>### 🟡 AMBER | Stark Ind</w:t>
-        <w:br/>
-        <w:t>* **Pipeline Impact:** $850,000 | **Target Close:** 2024-06-05 | **Health:** 55/100</w:t>
-        <w:br/>
-        <w:t>* **The Bottom Line:** Stark Ind's champion, Alex, has expressed concerns about ROI, and the sales team has yet to provide a customized case study. The deal's health is impacted by a 30-day delay in the decision-making process.</w:t>
-        <w:br/>
-        <w:t>* **Manager Action Today:** Schedule a meeting with Alex to address ROI concerns and provide a tailored case study to accelerate the decision-making process.</w:t>
-      </w:r>
-    </w:p>
-    <w:p/>
-    <w:p>
-      <w:pPr>
-        <w:pStyle w:val="Heading2"/>
-      </w:pPr>
-      <w:r>
-        <w:rPr>
-          <w:color w:val="F5A623"/>
-        </w:rPr>
-        <w:t>Wayne Ent</w:t>
-      </w:r>
-    </w:p>
-    <w:p>
-      <w:r>
-        <w:t>Value: $500,000   Close: 2024-06-25   Score: 70%</w:t>
-      </w:r>
-    </w:p>
-    <w:p>
-      <w:r>
-        <w:t>### 🟡 AMBER | Wayne Ent</w:t>
-        <w:br/>
-        <w:t>* **Pipeline Impact:** $500,000 | **Target Close:** 2024-06-25 | **Health:** 70/100</w:t>
-        <w:br/>
-        <w:t>* **The Bottom Line:** Wayne Ent's pipeline is at risk due to a 30-day delay in champion approval, which may impact the June close. The sales team must address the champion's concerns about ROI to regain momentum.</w:t>
-        <w:br/>
-        <w:t>* **Manager Action Today:** Schedule a call with the champion to discuss ROI concerns and provide additional value props to accelerate the approval process.</w:t>
-      </w:r>
-    </w:p>
-    <w:p/>
-    <w:p>
-      <w:pPr>
-        <w:pStyle w:val="Heading2"/>
-      </w:pPr>
-      <w:r>
-        <w:rPr>
-          <w:color w:val="1DB954"/>
-        </w:rPr>
         <w:t>Cyberdyne</w:t>
       </w:r>
     </w:p>
     <w:p>
       <w:r>
-        <w:t>Value: $900,000   Close: 2024-06-10   Score: 100%</w:t>
+        <w:t>Value: $900,000   Close: 2024-06-10   Score: 75%</w:t>
       </w:r>
     </w:p>
     <w:p>
       <w:r>
-        <w:t>### 🟢 GREEN | Cyberdyne</w:t>
+        <w:t>### 🟡 AMBER | Cyberdyne</w:t>
         <w:br/>
-        <w:t>* **Pipeline Impact:** $900,000 | **Target Close:** 2024-06-10 | **Health:** 100/100</w:t>
+        <w:t>* **Pipeline Impact:** $900,000 | **Target Close:** 2024-06-10 | **Health:** 75/100</w:t>
         <w:br/>
-        <w:t>* **The Bottom Line:** The champion, Rachel Lee, has consistently met milestones, and the customer's recent budget allocation indicates strong support. However, we need to address the lingering objection around integration costs.</w:t>
+        <w:t>* **The Bottom Line:** The deal's health is at 75% due to a 30-day delay in the champion's decision-making process, which is causing a ripple effect on the sales timeline. The sales team needs to re-engage the champion, John Lee, to address his concerns and get the deal back on track.</w:t>
         <w:br/>
-        <w:t>* **Manager Action Today:** Schedule a call with Rachel to discuss the integration plan and provide a detailed cost breakdown to alleviate customer concerns.</w:t>
+        <w:t>* **Manager Action Today:** Re-engage John Lee via a high-touch outreach to discuss and address his concerns, and schedule a follow-up meeting to re-iterate the value proposition.</w:t>
       </w:r>
     </w:p>
     <w:p/>
@@ -811,18 +811,18 @@
     </w:p>
     <w:p>
       <w:r>
-        <w:t>Value: $720,000   Close: 2024-05-28   Score: 100%</w:t>
+        <w:t>Value: $720,000   Close: 2024-05-28   Score: 90%</w:t>
       </w:r>
     </w:p>
     <w:p>
       <w:r>
         <w:t>### 🟢 GREEN | Massive Dynamic</w:t>
         <w:br/>
-        <w:t>* **Pipeline Impact:** $720,000 | **Target Close:** 2024-05-28 | **Health:** 100/100</w:t>
+        <w:t>* **Pipeline Impact:** $720,000 | **Target Close:** 2024-05-28 | **Health:** 90/100</w:t>
         <w:br/>
-        <w:t>* **The Bottom Line:** The champion, Alex Chen, has consistently demonstrated strong interest and engagement, with a recent meeting scheduled for next week. However, we need to address the lingering objection around pricing, which has been a sticking point since the initial proposal.</w:t>
+        <w:t>* **The Bottom Line:** The deal is on track to meet its target close date, driven by strong champion support from John Lee. However, we need to address the lingering objection around pricing, which is currently at 20% of the total value.</w:t>
         <w:br/>
-        <w:t>* **Manager Action Today:** Schedule a call with Alex to discuss pricing and address any concerns, and have the sales team prepare a revised proposal to present during the meeting.</w:t>
+        <w:t>* **Manager Action Today:** Schedule a call with John Lee to discuss pricing and finalize the agreement by the end of the week.</w:t>
       </w:r>
     </w:p>
     <w:p/>
@@ -839,18 +839,18 @@
     </w:p>
     <w:p>
       <w:r>
-        <w:t>Value: $250,000   Close: 2024-05-25   Score: 100%</w:t>
+        <w:t>Value: $250,000   Close: 2024-05-25   Score: 90%</w:t>
       </w:r>
     </w:p>
     <w:p>
       <w:r>
         <w:t>### 🟢 GREEN | Oscorp</w:t>
         <w:br/>
-        <w:t>* **Pipeline Impact:** $250,000 | **Target Close:** 2024-05-25 | **Health:** 100/100</w:t>
+        <w:t>* **Pipeline Impact:** $250,000 | **Target Close:** 2024-05-25 | **Health:** 90/100</w:t>
         <w:br/>
-        <w:t>* **The Bottom Line:** Oscorp's champion, Emily, has consistently shown strong interest in our solution, and recent meetings have addressed all major objections, positioning us for a smooth close. However, we must remain vigilant to ensure Emily's stakeholders are aligned behind the purchase.</w:t>
+        <w:t>* **The Bottom Line:** Oscorp's champion, Rachel Lee, has expressed enthusiasm for the solution, but we're seeing a slight delay in decision-making due to internal budget discussions. We need to address these concerns and provide a clear ROI analysis to move the deal forward.</w:t>
         <w:br/>
-        <w:t>* **Manager Action Today:** Schedule a final meeting with Emily to review the proposal and confirm stakeholder buy-in.</w:t>
+        <w:t>* **Manager Action Today:** Schedule a call with Rachel Lee to discuss budget constraints and provide a customized ROI presentation to alleviate concerns.</w:t>
       </w:r>
     </w:p>
     <w:p/>
@@ -867,18 +867,18 @@
     </w:p>
     <w:p>
       <w:r>
-        <w:t>Value: $120,000   Close: 2024-05-22   Score: 100%</w:t>
+        <w:t>Value: $120,000   Close: 2024-05-22   Score: 90%</w:t>
       </w:r>
     </w:p>
     <w:p>
       <w:r>
         <w:t>### 🟢 GREEN | Hooli</w:t>
         <w:br/>
-        <w:t>* **Pipeline Impact:** $120,000 | **Target Close:** 2024-05-22 | **Health:** 100/100</w:t>
+        <w:t>* **Pipeline Impact:** $120,000 | **Target Close:** 2024-05-22 | **Health:** 90/100</w:t>
         <w:br/>
-        <w:t>* **The Bottom Line:** Hooli's champion, Karen, has expressed strong interest in our solution, and the deal is on track to meet its target close date. However, we need to address the pending objection from the finance team regarding pricing.</w:t>
+        <w:t>* **The Bottom Line:** Hooli's champion, Karen, has expressed enthusiasm for the solution, but we're seeing a slight delay in decision-making due to internal budget constraints. We need to address these concerns and provide a clear ROI analysis to move the deal forward.</w:t>
         <w:br/>
-        <w:t>* **Manager Action Today:** Schedule a call with Karen to address the finance team's concerns and provide a revised pricing proposal.</w:t>
+        <w:t>* **Manager Action Today:** Schedule a call with Karen to discuss budget allocation and provide a customized ROI presentation to alleviate her concerns.</w:t>
       </w:r>
     </w:p>
     <w:p/>

</xml_diff>

<commit_message>
removed input function from main.py
</commit_message>
<xml_diff>
--- a/backend/outputs/pipeline_brief.docx
+++ b/backend/outputs/pipeline_brief.docx
@@ -76,6 +76,110 @@
           <w:p>
             <w:r>
               <w:t>Status</w:t>
+            </w:r>
+          </w:p>
+        </w:tc>
+      </w:tr>
+      <w:tr>
+        <w:tc>
+          <w:tcPr>
+            <w:tcW w:type="dxa" w:w="1728"/>
+          </w:tcPr>
+          <w:p>
+            <w:r>
+              <w:t>Stark Ind</w:t>
+            </w:r>
+          </w:p>
+        </w:tc>
+        <w:tc>
+          <w:tcPr>
+            <w:tcW w:type="dxa" w:w="1728"/>
+          </w:tcPr>
+          <w:p>
+            <w:r>
+              <w:t>$850,000</w:t>
+            </w:r>
+          </w:p>
+        </w:tc>
+        <w:tc>
+          <w:tcPr>
+            <w:tcW w:type="dxa" w:w="1728"/>
+          </w:tcPr>
+          <w:p>
+            <w:r>
+              <w:t>2024-06-05</w:t>
+            </w:r>
+          </w:p>
+        </w:tc>
+        <w:tc>
+          <w:tcPr>
+            <w:tcW w:type="dxa" w:w="1728"/>
+          </w:tcPr>
+          <w:p>
+            <w:r>
+              <w:t>0%</w:t>
+            </w:r>
+          </w:p>
+        </w:tc>
+        <w:tc>
+          <w:tcPr>
+            <w:tcW w:type="dxa" w:w="1728"/>
+          </w:tcPr>
+          <w:p>
+            <w:r>
+              <w:t>RED</w:t>
+            </w:r>
+          </w:p>
+        </w:tc>
+      </w:tr>
+      <w:tr>
+        <w:tc>
+          <w:tcPr>
+            <w:tcW w:type="dxa" w:w="1728"/>
+          </w:tcPr>
+          <w:p>
+            <w:r>
+              <w:t>Umbrella Corp</w:t>
+            </w:r>
+          </w:p>
+        </w:tc>
+        <w:tc>
+          <w:tcPr>
+            <w:tcW w:type="dxa" w:w="1728"/>
+          </w:tcPr>
+          <w:p>
+            <w:r>
+              <w:t>$650,000</w:t>
+            </w:r>
+          </w:p>
+        </w:tc>
+        <w:tc>
+          <w:tcPr>
+            <w:tcW w:type="dxa" w:w="1728"/>
+          </w:tcPr>
+          <w:p>
+            <w:r>
+              <w:t>2024-07-10</w:t>
+            </w:r>
+          </w:p>
+        </w:tc>
+        <w:tc>
+          <w:tcPr>
+            <w:tcW w:type="dxa" w:w="1728"/>
+          </w:tcPr>
+          <w:p>
+            <w:r>
+              <w:t>0%</w:t>
+            </w:r>
+          </w:p>
+        </w:tc>
+        <w:tc>
+          <w:tcPr>
+            <w:tcW w:type="dxa" w:w="1728"/>
+          </w:tcPr>
+          <w:p>
+            <w:r>
+              <w:t>RED</w:t>
             </w:r>
           </w:p>
         </w:tc>
@@ -221,111 +325,7 @@
           </w:tcPr>
           <w:p>
             <w:r>
-              <w:t>5%</w:t>
-            </w:r>
-          </w:p>
-        </w:tc>
-        <w:tc>
-          <w:tcPr>
-            <w:tcW w:type="dxa" w:w="1728"/>
-          </w:tcPr>
-          <w:p>
-            <w:r>
-              <w:t>RED</w:t>
-            </w:r>
-          </w:p>
-        </w:tc>
-      </w:tr>
-      <w:tr>
-        <w:tc>
-          <w:tcPr>
-            <w:tcW w:type="dxa" w:w="1728"/>
-          </w:tcPr>
-          <w:p>
-            <w:r>
-              <w:t>Umbrella Corp</w:t>
-            </w:r>
-          </w:p>
-        </w:tc>
-        <w:tc>
-          <w:tcPr>
-            <w:tcW w:type="dxa" w:w="1728"/>
-          </w:tcPr>
-          <w:p>
-            <w:r>
-              <w:t>$650,000</w:t>
-            </w:r>
-          </w:p>
-        </w:tc>
-        <w:tc>
-          <w:tcPr>
-            <w:tcW w:type="dxa" w:w="1728"/>
-          </w:tcPr>
-          <w:p>
-            <w:r>
-              <w:t>2024-07-10</w:t>
-            </w:r>
-          </w:p>
-        </w:tc>
-        <w:tc>
-          <w:tcPr>
-            <w:tcW w:type="dxa" w:w="1728"/>
-          </w:tcPr>
-          <w:p>
-            <w:r>
-              <w:t>10%</w:t>
-            </w:r>
-          </w:p>
-        </w:tc>
-        <w:tc>
-          <w:tcPr>
-            <w:tcW w:type="dxa" w:w="1728"/>
-          </w:tcPr>
-          <w:p>
-            <w:r>
-              <w:t>RED</w:t>
-            </w:r>
-          </w:p>
-        </w:tc>
-      </w:tr>
-      <w:tr>
-        <w:tc>
-          <w:tcPr>
-            <w:tcW w:type="dxa" w:w="1728"/>
-          </w:tcPr>
-          <w:p>
-            <w:r>
-              <w:t>Stark Ind</w:t>
-            </w:r>
-          </w:p>
-        </w:tc>
-        <w:tc>
-          <w:tcPr>
-            <w:tcW w:type="dxa" w:w="1728"/>
-          </w:tcPr>
-          <w:p>
-            <w:r>
-              <w:t>$850,000</w:t>
-            </w:r>
-          </w:p>
-        </w:tc>
-        <w:tc>
-          <w:tcPr>
-            <w:tcW w:type="dxa" w:w="1728"/>
-          </w:tcPr>
-          <w:p>
-            <w:r>
-              <w:t>2024-06-05</w:t>
-            </w:r>
-          </w:p>
-        </w:tc>
-        <w:tc>
-          <w:tcPr>
-            <w:tcW w:type="dxa" w:w="1728"/>
-          </w:tcPr>
-          <w:p>
-            <w:r>
-              <w:t>30%</w:t>
+              <w:t>0%</w:t>
             </w:r>
           </w:p>
         </w:tc>
@@ -377,7 +377,163 @@
           </w:tcPr>
           <w:p>
             <w:r>
-              <w:t>45%</w:t>
+              <w:t>15%</w:t>
+            </w:r>
+          </w:p>
+        </w:tc>
+        <w:tc>
+          <w:tcPr>
+            <w:tcW w:type="dxa" w:w="1728"/>
+          </w:tcPr>
+          <w:p>
+            <w:r>
+              <w:t>RED</w:t>
+            </w:r>
+          </w:p>
+        </w:tc>
+      </w:tr>
+      <w:tr>
+        <w:tc>
+          <w:tcPr>
+            <w:tcW w:type="dxa" w:w="1728"/>
+          </w:tcPr>
+          <w:p>
+            <w:r>
+              <w:t>Hooli</w:t>
+            </w:r>
+          </w:p>
+        </w:tc>
+        <w:tc>
+          <w:tcPr>
+            <w:tcW w:type="dxa" w:w="1728"/>
+          </w:tcPr>
+          <w:p>
+            <w:r>
+              <w:t>$120,000</w:t>
+            </w:r>
+          </w:p>
+        </w:tc>
+        <w:tc>
+          <w:tcPr>
+            <w:tcW w:type="dxa" w:w="1728"/>
+          </w:tcPr>
+          <w:p>
+            <w:r>
+              <w:t>2024-05-22</w:t>
+            </w:r>
+          </w:p>
+        </w:tc>
+        <w:tc>
+          <w:tcPr>
+            <w:tcW w:type="dxa" w:w="1728"/>
+          </w:tcPr>
+          <w:p>
+            <w:r>
+              <w:t>30%</w:t>
+            </w:r>
+          </w:p>
+        </w:tc>
+        <w:tc>
+          <w:tcPr>
+            <w:tcW w:type="dxa" w:w="1728"/>
+          </w:tcPr>
+          <w:p>
+            <w:r>
+              <w:t>RED</w:t>
+            </w:r>
+          </w:p>
+        </w:tc>
+      </w:tr>
+      <w:tr>
+        <w:tc>
+          <w:tcPr>
+            <w:tcW w:type="dxa" w:w="1728"/>
+          </w:tcPr>
+          <w:p>
+            <w:r>
+              <w:t>Massive Dynamic</w:t>
+            </w:r>
+          </w:p>
+        </w:tc>
+        <w:tc>
+          <w:tcPr>
+            <w:tcW w:type="dxa" w:w="1728"/>
+          </w:tcPr>
+          <w:p>
+            <w:r>
+              <w:t>$720,000</w:t>
+            </w:r>
+          </w:p>
+        </w:tc>
+        <w:tc>
+          <w:tcPr>
+            <w:tcW w:type="dxa" w:w="1728"/>
+          </w:tcPr>
+          <w:p>
+            <w:r>
+              <w:t>2024-05-28</w:t>
+            </w:r>
+          </w:p>
+        </w:tc>
+        <w:tc>
+          <w:tcPr>
+            <w:tcW w:type="dxa" w:w="1728"/>
+          </w:tcPr>
+          <w:p>
+            <w:r>
+              <w:t>60%</w:t>
+            </w:r>
+          </w:p>
+        </w:tc>
+        <w:tc>
+          <w:tcPr>
+            <w:tcW w:type="dxa" w:w="1728"/>
+          </w:tcPr>
+          <w:p>
+            <w:r>
+              <w:t>RED</w:t>
+            </w:r>
+          </w:p>
+        </w:tc>
+      </w:tr>
+      <w:tr>
+        <w:tc>
+          <w:tcPr>
+            <w:tcW w:type="dxa" w:w="1728"/>
+          </w:tcPr>
+          <w:p>
+            <w:r>
+              <w:t>Oscorp</w:t>
+            </w:r>
+          </w:p>
+        </w:tc>
+        <w:tc>
+          <w:tcPr>
+            <w:tcW w:type="dxa" w:w="1728"/>
+          </w:tcPr>
+          <w:p>
+            <w:r>
+              <w:t>$250,000</w:t>
+            </w:r>
+          </w:p>
+        </w:tc>
+        <w:tc>
+          <w:tcPr>
+            <w:tcW w:type="dxa" w:w="1728"/>
+          </w:tcPr>
+          <w:p>
+            <w:r>
+              <w:t>2024-05-25</w:t>
+            </w:r>
+          </w:p>
+        </w:tc>
+        <w:tc>
+          <w:tcPr>
+            <w:tcW w:type="dxa" w:w="1728"/>
+          </w:tcPr>
+          <w:p>
+            <w:r>
+              <w:t>60%</w:t>
             </w:r>
           </w:p>
         </w:tc>
@@ -429,7 +585,7 @@
           </w:tcPr>
           <w:p>
             <w:r>
-              <w:t>75%</w:t>
+              <w:t>65%</w:t>
             </w:r>
           </w:p>
         </w:tc>
@@ -444,163 +600,63 @@
           </w:p>
         </w:tc>
       </w:tr>
-      <w:tr>
-        <w:tc>
-          <w:tcPr>
-            <w:tcW w:type="dxa" w:w="1728"/>
-          </w:tcPr>
-          <w:p>
-            <w:r>
-              <w:t>Massive Dynamic</w:t>
-            </w:r>
-          </w:p>
-        </w:tc>
-        <w:tc>
-          <w:tcPr>
-            <w:tcW w:type="dxa" w:w="1728"/>
-          </w:tcPr>
-          <w:p>
-            <w:r>
-              <w:t>$720,000</w:t>
-            </w:r>
-          </w:p>
-        </w:tc>
-        <w:tc>
-          <w:tcPr>
-            <w:tcW w:type="dxa" w:w="1728"/>
-          </w:tcPr>
-          <w:p>
-            <w:r>
-              <w:t>2024-05-28</w:t>
-            </w:r>
-          </w:p>
-        </w:tc>
-        <w:tc>
-          <w:tcPr>
-            <w:tcW w:type="dxa" w:w="1728"/>
-          </w:tcPr>
-          <w:p>
-            <w:r>
-              <w:t>90%</w:t>
-            </w:r>
-          </w:p>
-        </w:tc>
-        <w:tc>
-          <w:tcPr>
-            <w:tcW w:type="dxa" w:w="1728"/>
-          </w:tcPr>
-          <w:p>
-            <w:r>
-              <w:t>GREEN</w:t>
-            </w:r>
-          </w:p>
-        </w:tc>
-      </w:tr>
-      <w:tr>
-        <w:tc>
-          <w:tcPr>
-            <w:tcW w:type="dxa" w:w="1728"/>
-          </w:tcPr>
-          <w:p>
-            <w:r>
-              <w:t>Oscorp</w:t>
-            </w:r>
-          </w:p>
-        </w:tc>
-        <w:tc>
-          <w:tcPr>
-            <w:tcW w:type="dxa" w:w="1728"/>
-          </w:tcPr>
-          <w:p>
-            <w:r>
-              <w:t>$250,000</w:t>
-            </w:r>
-          </w:p>
-        </w:tc>
-        <w:tc>
-          <w:tcPr>
-            <w:tcW w:type="dxa" w:w="1728"/>
-          </w:tcPr>
-          <w:p>
-            <w:r>
-              <w:t>2024-05-25</w:t>
-            </w:r>
-          </w:p>
-        </w:tc>
-        <w:tc>
-          <w:tcPr>
-            <w:tcW w:type="dxa" w:w="1728"/>
-          </w:tcPr>
-          <w:p>
-            <w:r>
-              <w:t>90%</w:t>
-            </w:r>
-          </w:p>
-        </w:tc>
-        <w:tc>
-          <w:tcPr>
-            <w:tcW w:type="dxa" w:w="1728"/>
-          </w:tcPr>
-          <w:p>
-            <w:r>
-              <w:t>GREEN</w:t>
-            </w:r>
-          </w:p>
-        </w:tc>
-      </w:tr>
-      <w:tr>
-        <w:tc>
-          <w:tcPr>
-            <w:tcW w:type="dxa" w:w="1728"/>
-          </w:tcPr>
-          <w:p>
-            <w:r>
-              <w:t>Hooli</w:t>
-            </w:r>
-          </w:p>
-        </w:tc>
-        <w:tc>
-          <w:tcPr>
-            <w:tcW w:type="dxa" w:w="1728"/>
-          </w:tcPr>
-          <w:p>
-            <w:r>
-              <w:t>$120,000</w:t>
-            </w:r>
-          </w:p>
-        </w:tc>
-        <w:tc>
-          <w:tcPr>
-            <w:tcW w:type="dxa" w:w="1728"/>
-          </w:tcPr>
-          <w:p>
-            <w:r>
-              <w:t>2024-05-22</w:t>
-            </w:r>
-          </w:p>
-        </w:tc>
-        <w:tc>
-          <w:tcPr>
-            <w:tcW w:type="dxa" w:w="1728"/>
-          </w:tcPr>
-          <w:p>
-            <w:r>
-              <w:t>90%</w:t>
-            </w:r>
-          </w:p>
-        </w:tc>
-        <w:tc>
-          <w:tcPr>
-            <w:tcW w:type="dxa" w:w="1728"/>
-          </w:tcPr>
-          <w:p>
-            <w:r>
-              <w:t>GREEN</w:t>
-            </w:r>
-          </w:p>
-        </w:tc>
-      </w:tr>
     </w:tbl>
+    <w:p/>
+    <w:p>
+      <w:pPr>
+        <w:pStyle w:val="Heading2"/>
+      </w:pPr>
+      <w:r>
+        <w:rPr>
+          <w:color w:val="E53935"/>
+        </w:rPr>
+        <w:t>Stark Ind</w:t>
+      </w:r>
+    </w:p>
+    <w:p>
+      <w:r>
+        <w:t>Value: $850,000   Close: 2024-06-05   Score: 0%</w:t>
+      </w:r>
+    </w:p>
+    <w:p>
+      <w:r>
+        <w:t>### 🔴 RED | Stark Ind</w:t>
+        <w:br/>
+        <w:t>* **Pipeline Impact:** $850,000 | **Target Close:** 2024-06-05 | **Health:** 0/100</w:t>
+        <w:br/>
+        <w:t>* **The Bottom Line:** The deal is stalled due to unresolved budget concerns with the champion, John Lee. The lack of recent activity and no clear next steps indicate a high risk of losing momentum.</w:t>
+        <w:br/>
+        <w:t>* **Manager Action Today:** Schedule an urgent call with John Lee to address budget concerns and re-engage the sales process.</w:t>
+      </w:r>
+    </w:p>
+    <w:p/>
+    <w:p>
+      <w:pPr>
+        <w:pStyle w:val="Heading2"/>
+      </w:pPr>
+      <w:r>
+        <w:rPr>
+          <w:color w:val="E53935"/>
+        </w:rPr>
+        <w:t>Umbrella Corp</w:t>
+      </w:r>
+    </w:p>
+    <w:p>
+      <w:r>
+        <w:t>Value: $650,000   Close: 2024-07-10   Score: 0%</w:t>
+      </w:r>
+    </w:p>
+    <w:p>
+      <w:r>
+        <w:t>### 🔴 RED | Umbrella Corp</w:t>
+        <w:br/>
+        <w:t>* **Pipeline Impact:** $650,000 | **Target Close:** 2024-07-10 | **Health:** 0/100</w:t>
+        <w:br/>
+        <w:t>* **The Bottom Line:** The deal is stalled due to ongoing concerns from the CTO, John Lee, about integration costs. The champion, Emily Chen, is still engaged but needs a clear plan to address the CTO's objections.</w:t>
+        <w:br/>
+        <w:t>* **Manager Action Today:** Schedule a call with Emily to discuss a revised proposal addressing John's concerns and ensure a clear path forward.</w:t>
+      </w:r>
+    </w:p>
     <w:p/>
     <w:p>
       <w:pPr>
@@ -624,9 +680,9 @@
         <w:br/>
         <w:t>* **Pipeline Impact:** $450,000 | **Target Close:** 2024-05-30 | **Health:** 0/100</w:t>
         <w:br/>
-        <w:t>* **The Bottom Line:** Initech's champion, John Smith, has expressed concerns about ROI, and the customer has stalled on the contract review. We need to address these concerns and re-engage John to move the deal forward.</w:t>
+        <w:t>* **The Bottom Line:** Initech's champion, John Smith, has expressed concerns about ROI, and the sales team has yet to address these concerns. The lack of recent activity and no clear next steps indicate a stalled deal.</w:t>
         <w:br/>
-        <w:t>* **Manager Action Today:** Schedule a call with John Smith to discuss Initech's ROI concerns and re-iterate the value proposition.</w:t>
+        <w:t>* **Manager Action Today:** Schedule a call with John Smith to discuss Initech's ROI concerns and create a revised plan to move the deal forward.</w:t>
       </w:r>
     </w:p>
     <w:p/>
@@ -652,9 +708,9 @@
         <w:br/>
         <w:t>* **Pipeline Impact:** $340,000 | **Target Close:** 2024-06-15 | **Health:** 0/100</w:t>
         <w:br/>
-        <w:t>* **The Bottom Line:** Acme Corp's deal momentum has stalled due to ongoing budget approval delays, and key decision-maker, Rachel Lee, has expressed concerns about ROI. Champion, John Smith, is still engaged but needs to escalate the issue to secure approval.</w:t>
+        <w:t>* **The Bottom Line:** Acme Corp's deal momentum has stalled due to ongoing budget approval delays, and the champion, John Lee, is now on vacation. This creates a high-risk situation with a tight target close date.</w:t>
         <w:br/>
-        <w:t>* **Manager Action Today:** Escalate the issue to Rachel Lee and offer a revised ROI analysis to address her concerns.</w:t>
+        <w:t>* **Manager Action Today:** Reach out to John Lee's backup contact, Emily Chen, to assess the deal's status and expedite budget approval.</w:t>
       </w:r>
     </w:p>
     <w:p/>
@@ -671,74 +727,18 @@
     </w:p>
     <w:p>
       <w:r>
-        <w:t>Value: $180,000   Close: 2024-06-20   Score: 5%</w:t>
+        <w:t>Value: $180,000   Close: 2024-06-20   Score: 0%</w:t>
       </w:r>
     </w:p>
     <w:p>
       <w:r>
         <w:t>### 🔴 RED | Globex Inc</w:t>
         <w:br/>
-        <w:t>* **Pipeline Impact:** $180,000 | **Target Close:** 2024-06-20 | **Health:** 5/100</w:t>
+        <w:t>* **Pipeline Impact:** $180,000 | **Target Close:** 2024-06-20 | **Health:** 0/100</w:t>
         <w:br/>
-        <w:t>* **The Bottom Line:** The deal is at risk due to a 30-day delay in the champion's decision-making process, and the customer has raised concerns about the total cost of ownership. The sales team needs to address these concerns and re-engage the champion to get the deal back on track.</w:t>
+        <w:t>* **The Bottom Line:** The deal is stalled due to ongoing budget approval delays, and the champion, Emily Lee, is facing resistance from the finance team. We need to re-engage Emily and address the budget concerns to get the deal back on track.</w:t>
         <w:br/>
-        <w:t>* **Manager Action Today:** Schedule a call with the champion to discuss the total cost of ownership and provide a revised proposal to alleviate their concerns.</w:t>
-      </w:r>
-    </w:p>
-    <w:p/>
-    <w:p>
-      <w:pPr>
-        <w:pStyle w:val="Heading2"/>
-      </w:pPr>
-      <w:r>
-        <w:rPr>
-          <w:color w:val="E53935"/>
-        </w:rPr>
-        <w:t>Umbrella Corp</w:t>
-      </w:r>
-    </w:p>
-    <w:p>
-      <w:r>
-        <w:t>Value: $650,000   Close: 2024-07-10   Score: 10%</w:t>
-      </w:r>
-    </w:p>
-    <w:p>
-      <w:r>
-        <w:t>### 🔴 RED | Umbrella Corp</w:t>
-        <w:br/>
-        <w:t>* **Pipeline Impact:** $650,000 | **Target Close:** 2024-07-10 | **Health:** 10/100</w:t>
-        <w:br/>
-        <w:t>* **The Bottom Line:** The deal is at risk due to a 30-day delay in the decision-making process, and the champion, Rachel Lee, has expressed concerns about the total cost of ownership. We need to address these concerns and expedite the decision-making process to meet the target close date.</w:t>
-        <w:br/>
-        <w:t>* **Manager Action Today:** Schedule a call with Rachel Lee to discuss the total cost of ownership and provide a revised proposal to alleviate her concerns.</w:t>
-      </w:r>
-    </w:p>
-    <w:p/>
-    <w:p>
-      <w:pPr>
-        <w:pStyle w:val="Heading2"/>
-      </w:pPr>
-      <w:r>
-        <w:rPr>
-          <w:color w:val="E53935"/>
-        </w:rPr>
-        <w:t>Stark Ind</w:t>
-      </w:r>
-    </w:p>
-    <w:p>
-      <w:r>
-        <w:t>Value: $850,000   Close: 2024-06-05   Score: 30%</w:t>
-      </w:r>
-    </w:p>
-    <w:p>
-      <w:r>
-        <w:t>### 🔴 RED | Stark Ind</w:t>
-        <w:br/>
-        <w:t>* **Pipeline Impact:** $850,000 | **Target Close:** 2024-06-05 | **Health:** 30/100</w:t>
-        <w:br/>
-        <w:t>* **The Bottom Line:** The deal's health is at 30% due to a 3-week delay in the champion's decision-making process, which has stalled the contract negotiation. The sales team needs to re-engage the champion, John Lee, to overcome the objection about pricing.</w:t>
-        <w:br/>
-        <w:t>* **Manager Action Today:** Re-engage John Lee with a call to discuss pricing concerns and provide a revised proposal by EOD.</w:t>
+        <w:t>* **Manager Action Today:** Re-schedule a call with Emily Lee to discuss the budget approval process and potential solutions to overcome the finance team's objections.</w:t>
       </w:r>
     </w:p>
     <w:p/>
@@ -755,18 +755,102 @@
     </w:p>
     <w:p>
       <w:r>
-        <w:t>Value: $500,000   Close: 2024-06-25   Score: 45%</w:t>
+        <w:t>Value: $500,000   Close: 2024-06-25   Score: 15%</w:t>
       </w:r>
     </w:p>
     <w:p>
       <w:r>
         <w:t>### 🔴 RED | Wayne Ent</w:t>
         <w:br/>
-        <w:t>* **Pipeline Impact:** $500,000 | **Target Close:** 2024-06-25 | **Health:** 45/100</w:t>
+        <w:t>* **Pipeline Impact:** $500,000 | **Target Close:** 2024-06-25 | **Health:** 15/100</w:t>
         <w:br/>
-        <w:t>* **The Bottom Line:** Wayne Ent's pipeline is at risk due to a 30-day delay in champion feedback and a 20% drop in decision-maker engagement. Champion, Rachel Lee, has expressed concerns about ROI, which needs to be addressed ASAP.</w:t>
+        <w:t>* **The Bottom Line:** The deal's health is critically low due to stalled negotiations with key decision-maker, Rachel Lee, who has expressed concerns about ROI. Champion, Alex Chen, needs to address these concerns ASAP to prevent deal loss.</w:t>
         <w:br/>
-        <w:t>* **Manager Action Today:** Schedule a call with Rachel Lee to discuss ROI concerns and provide a customized case study to alleviate her doubts.</w:t>
+        <w:t>* **Manager Action Today:** Schedule a call with Alex Chen to discuss a revised ROI analysis and ensure he's equipped to address Rachel Lee's concerns.</w:t>
+      </w:r>
+    </w:p>
+    <w:p/>
+    <w:p>
+      <w:pPr>
+        <w:pStyle w:val="Heading2"/>
+      </w:pPr>
+      <w:r>
+        <w:rPr>
+          <w:color w:val="E53935"/>
+        </w:rPr>
+        <w:t>Hooli</w:t>
+      </w:r>
+    </w:p>
+    <w:p>
+      <w:r>
+        <w:t>Value: $120,000   Close: 2024-05-22   Score: 30%</w:t>
+      </w:r>
+    </w:p>
+    <w:p>
+      <w:r>
+        <w:t>### 🔴 RED | Hooli</w:t>
+        <w:br/>
+        <w:t>* **Pipeline Impact:** $120,000 | **Target Close:** 2024-05-22 | **Health:** 30/100</w:t>
+        <w:br/>
+        <w:t>* **The Bottom Line:** The deal is at risk due to a 3-week delay in the champion's decision-making process, and the customer's recent objection about pricing. The sales team needs to re-engage the champion and address the pricing concerns to get the deal back on track.</w:t>
+        <w:br/>
+        <w:t>* **Manager Action Today:** Re-engage the champion by scheduling a call to discuss the pricing concerns and provide a revised proposal by the end of the day.</w:t>
+      </w:r>
+    </w:p>
+    <w:p/>
+    <w:p>
+      <w:pPr>
+        <w:pStyle w:val="Heading2"/>
+      </w:pPr>
+      <w:r>
+        <w:rPr>
+          <w:color w:val="E53935"/>
+        </w:rPr>
+        <w:t>Massive Dynamic</w:t>
+      </w:r>
+    </w:p>
+    <w:p>
+      <w:r>
+        <w:t>Value: $720,000   Close: 2024-05-28   Score: 60%</w:t>
+      </w:r>
+    </w:p>
+    <w:p>
+      <w:r>
+        <w:t>### 🔴 RED | Massive Dynamic</w:t>
+        <w:br/>
+        <w:t>* **Pipeline Impact:** $720,000 | **Target Close:** 2024-05-28 | **Health:** 60/100</w:t>
+        <w:br/>
+        <w:t>* **The Bottom Line:** The deal's health is slipping due to a 30% decrease in champion engagement over the past two weeks, and a new objection from the procurement team regarding pricing. This may indicate a loss of momentum and increased resistance from key stakeholders.</w:t>
+        <w:br/>
+        <w:t>* **Manager Action Today:** Schedule an urgent meeting with the champion to address concerns and re-engage their support, and assign a dedicated sales engineer to address the procurement team's pricing objection.</w:t>
+      </w:r>
+    </w:p>
+    <w:p/>
+    <w:p>
+      <w:pPr>
+        <w:pStyle w:val="Heading2"/>
+      </w:pPr>
+      <w:r>
+        <w:rPr>
+          <w:color w:val="E53935"/>
+        </w:rPr>
+        <w:t>Oscorp</w:t>
+      </w:r>
+    </w:p>
+    <w:p>
+      <w:r>
+        <w:t>Value: $250,000   Close: 2024-05-25   Score: 60%</w:t>
+      </w:r>
+    </w:p>
+    <w:p>
+      <w:r>
+        <w:t>### 🔴 RED | Oscorp</w:t>
+        <w:br/>
+        <w:t>* **Pipeline Impact:** $250,000 | **Target Close:** 2024-05-25 | **Health:** 60/100</w:t>
+        <w:br/>
+        <w:t>* **The Bottom Line:** Oscorp's champion, Rachel Lee, has expressed concerns about the total cost of ownership, and the sales team has yet to provide a detailed ROI analysis. The deal's health is at risk due to a 30-day delay in the decision-making process.</w:t>
+        <w:br/>
+        <w:t>* **Manager Action Today:** Schedule a call with Rachel Lee to address her concerns and provide a customized ROI analysis to re-engage the Oscorp team.</w:t>
       </w:r>
     </w:p>
     <w:p/>
@@ -783,102 +867,18 @@
     </w:p>
     <w:p>
       <w:r>
-        <w:t>Value: $900,000   Close: 2024-06-10   Score: 75%</w:t>
+        <w:t>Value: $900,000   Close: 2024-06-10   Score: 65%</w:t>
       </w:r>
     </w:p>
     <w:p>
       <w:r>
         <w:t>### 🟡 AMBER | Cyberdyne</w:t>
         <w:br/>
-        <w:t>* **Pipeline Impact:** $900,000 | **Target Close:** 2024-06-10 | **Health:** 75/100</w:t>
+        <w:t>* **Pipeline Impact:** $900,000 | **Target Close:** 2024-06-10 | **Health:** 65/100</w:t>
         <w:br/>
-        <w:t>* **The Bottom Line:** The deal's health is at 75% due to a 30-day delay in the champion's decision-making process, which is causing a ripple effect on the sales timeline. The sales team needs to re-engage the champion, John Lee, to address his concerns and get the deal back on track.</w:t>
+        <w:t>* **The Bottom Line:** The deal's health is slipping due to a 30% decrease in champion engagement over the past two weeks, despite a strong initial interest from the CTO. The sales team must address these concerns and re-engage the champion to meet the target close date.</w:t>
         <w:br/>
-        <w:t>* **Manager Action Today:** Re-engage John Lee via a high-touch outreach to discuss and address his concerns, and schedule a follow-up meeting to re-iterate the value proposition.</w:t>
-      </w:r>
-    </w:p>
-    <w:p/>
-    <w:p>
-      <w:pPr>
-        <w:pStyle w:val="Heading2"/>
-      </w:pPr>
-      <w:r>
-        <w:rPr>
-          <w:color w:val="1DB954"/>
-        </w:rPr>
-        <w:t>Massive Dynamic</w:t>
-      </w:r>
-    </w:p>
-    <w:p>
-      <w:r>
-        <w:t>Value: $720,000   Close: 2024-05-28   Score: 90%</w:t>
-      </w:r>
-    </w:p>
-    <w:p>
-      <w:r>
-        <w:t>### 🟢 GREEN | Massive Dynamic</w:t>
-        <w:br/>
-        <w:t>* **Pipeline Impact:** $720,000 | **Target Close:** 2024-05-28 | **Health:** 90/100</w:t>
-        <w:br/>
-        <w:t>* **The Bottom Line:** The deal is on track to meet its target close date, driven by strong champion support from John Lee. However, we need to address the lingering objection around pricing, which is currently at 20% of the total value.</w:t>
-        <w:br/>
-        <w:t>* **Manager Action Today:** Schedule a call with John Lee to discuss pricing and finalize the agreement by the end of the week.</w:t>
-      </w:r>
-    </w:p>
-    <w:p/>
-    <w:p>
-      <w:pPr>
-        <w:pStyle w:val="Heading2"/>
-      </w:pPr>
-      <w:r>
-        <w:rPr>
-          <w:color w:val="1DB954"/>
-        </w:rPr>
-        <w:t>Oscorp</w:t>
-      </w:r>
-    </w:p>
-    <w:p>
-      <w:r>
-        <w:t>Value: $250,000   Close: 2024-05-25   Score: 90%</w:t>
-      </w:r>
-    </w:p>
-    <w:p>
-      <w:r>
-        <w:t>### 🟢 GREEN | Oscorp</w:t>
-        <w:br/>
-        <w:t>* **Pipeline Impact:** $250,000 | **Target Close:** 2024-05-25 | **Health:** 90/100</w:t>
-        <w:br/>
-        <w:t>* **The Bottom Line:** Oscorp's champion, Rachel Lee, has expressed enthusiasm for the solution, but we're seeing a slight delay in decision-making due to internal budget discussions. We need to address these concerns and provide a clear ROI analysis to move the deal forward.</w:t>
-        <w:br/>
-        <w:t>* **Manager Action Today:** Schedule a call with Rachel Lee to discuss budget constraints and provide a customized ROI presentation to alleviate concerns.</w:t>
-      </w:r>
-    </w:p>
-    <w:p/>
-    <w:p>
-      <w:pPr>
-        <w:pStyle w:val="Heading2"/>
-      </w:pPr>
-      <w:r>
-        <w:rPr>
-          <w:color w:val="1DB954"/>
-        </w:rPr>
-        <w:t>Hooli</w:t>
-      </w:r>
-    </w:p>
-    <w:p>
-      <w:r>
-        <w:t>Value: $120,000   Close: 2024-05-22   Score: 90%</w:t>
-      </w:r>
-    </w:p>
-    <w:p>
-      <w:r>
-        <w:t>### 🟢 GREEN | Hooli</w:t>
-        <w:br/>
-        <w:t>* **Pipeline Impact:** $120,000 | **Target Close:** 2024-05-22 | **Health:** 90/100</w:t>
-        <w:br/>
-        <w:t>* **The Bottom Line:** Hooli's champion, Karen, has expressed enthusiasm for the solution, but we're seeing a slight delay in decision-making due to internal budget constraints. We need to address these concerns and provide a clear ROI analysis to move the deal forward.</w:t>
-        <w:br/>
-        <w:t>* **Manager Action Today:** Schedule a call with Karen to discuss budget allocation and provide a customized ROI presentation to alleviate her concerns.</w:t>
+        <w:t>* **Manager Action Today:** Schedule a call with the CTO to understand the root cause of decreased engagement and develop a plan to re-engage the champion.</w:t>
       </w:r>
     </w:p>
     <w:p/>

</xml_diff>